<commit_message>
the base update for /capital-allocation /comps and /tearsheet skills with free client
</commit_message>
<xml_diff>
--- a/templates/research_note.docx
+++ b/templates/research_note.docx
@@ -46,11 +46,6 @@
       </w:pPr>
       <w:r>
         <w:t>Executive Summary</w:t>
-      </w:r>
-    </w:p>
-    <w:p>
-      <w:r>
-        <w:t>{{ five_key_tensions }}</w:t>
       </w:r>
     </w:p>
     <w:p>
@@ -107,19 +102,6 @@
         <w:pStyle w:val="Heading1"/>
       </w:pPr>
       <w:r>
-        <w:t>Key News &amp; Events</w:t>
-      </w:r>
-    </w:p>
-    <w:p>
-      <w:r>
-        <w:t>{{ news_timeline }}</w:t>
-      </w:r>
-    </w:p>
-    <w:p>
-      <w:pPr>
-        <w:pStyle w:val="Heading1"/>
-      </w:pPr>
-      <w:r>
         <w:t>Financial Analysis</w:t>
       </w:r>
     </w:p>
@@ -136,24 +118,6 @@
     <w:p>
       <w:r>
         <w:t>{{ margin_chart }}</w:t>
-      </w:r>
-    </w:p>
-    <w:p>
-      <w:pPr>
-        <w:pStyle w:val="Heading2"/>
-      </w:pPr>
-      <w:r>
-        <w:t>Cost Structure &amp; Margin Drivers</w:t>
-      </w:r>
-    </w:p>
-    <w:p>
-      <w:r>
-        <w:t>{{ cost_margin_analysis }}</w:t>
-      </w:r>
-    </w:p>
-    <w:p>
-      <w:r>
-        <w:t>{{p opex_breakdown_table }}</w:t>
       </w:r>
     </w:p>
     <w:p>
@@ -201,19 +165,6 @@
       </w:r>
     </w:p>
     <w:p>
-      <w:pPr>
-        <w:pStyle w:val="Heading1"/>
-      </w:pPr>
-      <w:r>
-        <w:t>Industry Deep Dive</w:t>
-      </w:r>
-    </w:p>
-    <w:p>
-      <w:r>
-        <w:t>{{ industry_deep_dive }}</w:t>
-      </w:r>
-    </w:p>
-    <w:p>
       <w:r>
         <w:t>{% if has_guidance %}</w:t>
       </w:r>
@@ -241,7 +192,12 @@
         <w:pStyle w:val="Heading1"/>
       </w:pPr>
       <w:r>
-        <w:t>What You Need to Believe</w:t>
+        <w:t>Scenario Analysis</w:t>
+      </w:r>
+    </w:p>
+    <w:p>
+      <w:r>
+        <w:t>{{ scenario_chart }}</w:t>
       </w:r>
     </w:p>
     <w:p>
@@ -249,17 +205,22 @@
         <w:pStyle w:val="Heading2"/>
       </w:pPr>
       <w:r>
-        <w:t>To Go Long</w:t>
+        <w:t>Bull Case</w:t>
       </w:r>
     </w:p>
     <w:p>
       <w:r>
-        <w:t>{{ bull_beliefs }}</w:t>
+        <w:t>Probability: {{ bull_probability }}</w:t>
       </w:r>
     </w:p>
     <w:p>
       <w:r>
-        <w:t>Price Target: {{ bull_target }}</w:t>
+        <w:t>Price Target: {{ bull_price_target }}</w:t>
+      </w:r>
+    </w:p>
+    <w:p>
+      <w:r>
+        <w:t>{{ bull_description }}</w:t>
       </w:r>
     </w:p>
     <w:p>
@@ -267,17 +228,22 @@
         <w:pStyle w:val="Heading2"/>
       </w:pPr>
       <w:r>
-        <w:t>To Go Short</w:t>
+        <w:t>Base Case</w:t>
       </w:r>
     </w:p>
     <w:p>
       <w:r>
-        <w:t>{{ bear_beliefs }}</w:t>
+        <w:t>Probability: {{ base_probability }}</w:t>
       </w:r>
     </w:p>
     <w:p>
       <w:r>
-        <w:t>Price Target: {{ bear_target }}</w:t>
+        <w:t>Price Target: {{ base_price_target }}</w:t>
+      </w:r>
+    </w:p>
+    <w:p>
+      <w:r>
+        <w:t>{{ base_description }}</w:t>
       </w:r>
     </w:p>
     <w:p>
@@ -285,30 +251,22 @@
         <w:pStyle w:val="Heading2"/>
       </w:pPr>
       <w:r>
-        <w:t>Risk/Reward Assessment</w:t>
+        <w:t>Bear Case</w:t>
       </w:r>
     </w:p>
     <w:p>
       <w:r>
-        <w:t>{{ risk_reward_assessment }}</w:t>
-      </w:r>
-    </w:p>
-    <w:p>
-      <w:pPr>
-        <w:pStyle w:val="Heading1"/>
-      </w:pPr>
-      <w:r>
-        <w:t>Forward Catalysts</w:t>
+        <w:t>Probability: {{ bear_probability }}</w:t>
       </w:r>
     </w:p>
     <w:p>
       <w:r>
-        <w:t>{{ forward_catalysts }}</w:t>
+        <w:t>Price Target: {{ bear_price_target }}</w:t>
       </w:r>
     </w:p>
     <w:p>
       <w:r>
-        <w:t>{{ policy_backdrop }}</w:t>
+        <w:t>{{ bear_description }}</w:t>
       </w:r>
     </w:p>
     <w:p>
@@ -394,40 +352,6 @@
     <w:p>
       <w:r>
         <w:t>{{ risks_summary }}</w:t>
-      </w:r>
-    </w:p>
-    <w:p>
-      <w:pPr>
-        <w:pStyle w:val="Heading1"/>
-      </w:pPr>
-      <w:r>
-        <w:t>Monitoring Framework</w:t>
-      </w:r>
-    </w:p>
-    <w:p>
-      <w:pPr>
-        <w:pStyle w:val="Heading2"/>
-      </w:pPr>
-      <w:r>
-        <w:t>Quantitative Monitors</w:t>
-      </w:r>
-    </w:p>
-    <w:p>
-      <w:r>
-        <w:t>{{ monitoring_quantitative }}</w:t>
-      </w:r>
-    </w:p>
-    <w:p>
-      <w:pPr>
-        <w:pStyle w:val="Heading2"/>
-      </w:pPr>
-      <w:r>
-        <w:t>Qualitative Monitors</w:t>
-      </w:r>
-    </w:p>
-    <w:p>
-      <w:r>
-        <w:t>{{ monitoring_qualitative }}</w:t>
       </w:r>
     </w:p>
     <w:p>

</xml_diff>